<commit_message>
Nietzsche: reescribe los apuntes con la estructura del trabajo
Co-Authored-By: Claude Opus 5.5 <noreply@anthropic.com>
Claude-Session: https://claude.ai/code/session_01Fj7SZp3YYQfX9U1XL9NLBt
</commit_message>
<xml_diff>
--- a/formacion-general/hombre-y-mundo-moderno/apuntes-word/Nietzsche.docx
+++ b/formacion-general/hombre-y-mundo-moderno/apuntes-word/Nietzsche.docx
@@ -28,34 +28,43 @@
         <w:pStyle w:val="Heading1"/>
       </w:pPr>
       <w:r>
-        <w:t xml:space="preserve">1. Contexto</w:t>
-      </w:r>
-    </w:p>
-    <w:p>
-      <w:pPr>
-        <w:spacing w:after="160" w:line="360"/>
-        <w:jc w:val="both"/>
-      </w:pPr>
-      <w:r>
-        <w:t xml:space="preserve">Nietzsche es uno de los tres maestros de la sospecha de Paul Ricoeur, junto con Marx y Freud.</w:t>
-      </w:r>
-    </w:p>
-    <w:p>
-      <w:pPr>
-        <w:spacing w:after="160" w:line="360"/>
-        <w:jc w:val="both"/>
-      </w:pPr>
-      <w:r>
-        <w:t xml:space="preserve">Su vida coincide con la unificación de Alemania. Tras la caída del Sacro Imperio Romano Germánico en 1806 por las guerras napoleónicas, los territorios alemanes quedan divididos. Con el Congreso de Viena (1815) se crea la Confederación Germánica, con dos polos: Prusia y Austria. Prusia gana peso con el Zollverein (1834), la revolución de 1848 fracasa y en 1862 Bismarck llega al poder. Prusia derrota a Austria (1866) y a Francia (1870-71), y en 1871 se proclama el II Reich en Versalles, humillando a Francia.</w:t>
-      </w:r>
-    </w:p>
-    <w:p>
-      <w:pPr>
-        <w:spacing w:after="160" w:line="360"/>
-        <w:jc w:val="both"/>
-      </w:pPr>
-      <w:r>
-        <w:t xml:space="preserve">Nietzsche nace en 1844, hijo de un pastor luterano. Se queda huérfano de padre a los 4 años y le crían solo mujeres. Estudia filología clásica en Bonn y Leipzig. En 1865 descubre a Schopenhauer y le supone una revelación. En 1869 es catedrático de Filología Clásica en Basilea y se hace amigo de Wagner, al que visita constantemente en Tribschen. Por su salud se jubila en 1879 y pasa 10 años de soledad errante, en los que escribe sus obras principales. En 1889 sufre un colapso mental en Turín, le cuidan su madre y su hermana Elisabeth y muere en Weimar en 1900. Su hermana manipuló sus escritos y eso facilitó que después lo usaran los nazis.</w:t>
+        <w:t xml:space="preserve">1. Contexto histórico: sitúe a Nietzsche en su época</w:t>
+      </w:r>
+    </w:p>
+    <w:p>
+      <w:pPr>
+        <w:spacing w:after="160" w:line="360"/>
+        <w:jc w:val="both"/>
+      </w:pPr>
+      <w:r>
+        <w:t xml:space="preserve">Paul Ricoeur, en Freud: una interpretación de la cultura (1965), llama maestros de la sospecha a tres autores que nos han hecho dudar de nuestra propia conciencia: Karl Marx, Friedrich Nietzsche y Sigmund Freud. En Nietzsche lo que se esconde detrás de lo que pensamos y valoramos es la voluntad de poder.</w:t>
+      </w:r>
+    </w:p>
+    <w:p>
+      <w:pPr>
+        <w:spacing w:after="160" w:line="360"/>
+        <w:jc w:val="both"/>
+      </w:pPr>
+      <w:r>
+        <w:t xml:space="preserve">La vida de Nietzsche coincide con la unificación de Alemania. Tras la caída del Sacro Imperio Romano Germánico en 1806 por las guerras napoleónicas, los territorios alemanes quedan divididos. Con el Congreso de Viena (1815) se crea la Confederación Germánica, con dos polos enfrentados: Prusia y Austria. Prusia gana peso con el Zollverein (1834), la revolución de 1848 fracasa y en 1862 Otto von Bismarck llega al poder. Prusia derrota a Austria (1866) y a Francia (1870-71), y en 1871 se proclama el II Reich en Versalles, humillando a Francia. Es una Alemania nueva, que se industrializa rápido, con una burguesía satisfecha y nacionalista que a Nietzsche le parecía mediocre.</w:t>
+      </w:r>
+    </w:p>
+    <w:p>
+      <w:pPr>
+        <w:spacing w:after="160" w:line="360"/>
+        <w:jc w:val="both"/>
+      </w:pPr>
+      <w:r>
+        <w:t xml:space="preserve">Nietzsche nace en 1844, hijo de un pastor luterano. Se queda huérfano de padre a los 4 años y le crían solo mujeres. Estudia filología clásica en Leipzig y Bonn. En 1865 descubre a Schopenhauer, El mundo como voluntad y representación, y le supone una revelación. En 1869 es catedrático de Filología Clásica en Basilea y se hace amigo de Richard Wagner, al que visita constantemente en Tribschen. Por su mala salud se jubila en 1879 y pasa 10 años de soledad errante, en los que escribe sus obras principales. En 1889 sufre un colapso mental en Turín, le cuidan su madre y su hermana Elisabeth, y muere en Weimar en 1900. Su hermana manipuló después sus escritos, y eso facilitó que los nazis se apropiaran de él.</w:t>
+      </w:r>
+    </w:p>
+    <w:p>
+      <w:pPr>
+        <w:spacing w:after="160" w:line="360"/>
+        <w:jc w:val="both"/>
+      </w:pPr>
+      <w:r>
+        <w:t xml:space="preserve">Sus obras principales son El nacimiento de la tragedia (1872), Humano, demasiado humano (1878), La gaya ciencia (1882), Así habló Zaratustra (1883-85), Más allá del bien y del mal (1886), La genealogía de la moral (1887), El Anticristo (1888) y Ecce homo (1889).</w:t>
       </w:r>
     </w:p>
     <w:p>
@@ -72,25 +81,78 @@
         <w:jc w:val="both"/>
       </w:pPr>
       <w:r>
-        <w:t xml:space="preserve">Schopenhauer es la influencia principal: decía que por debajo de la razón hay una voluntad ciega e irracional. Nietzsche coge esa idea pero en vez de ser pesimista como él, la convierte en afirmar la vida.</w:t>
-      </w:r>
-    </w:p>
-    <w:p>
-      <w:pPr>
-        <w:spacing w:after="160" w:line="360"/>
-        <w:jc w:val="both"/>
-      </w:pPr>
-      <w:r>
-        <w:t xml:space="preserve">Wagner: tuvo un proyecto junto a él (la ópera, el arte trágico), pero rompieron cuando Wagner se volvió hacia temas cristianos.</w:t>
-      </w:r>
-    </w:p>
-    <w:p>
-      <w:pPr>
-        <w:spacing w:after="160" w:line="360"/>
-        <w:jc w:val="both"/>
-      </w:pPr>
-      <w:r>
-        <w:t xml:space="preserve">Como filólogo admira la Grecia trágica y a Heráclito (todo está en movimiento), y critica a Sócrates y a Platón por poner la razón y la moral por encima de la vida. Por eso dice que el cristianismo es platonismo para el pueblo.</w:t>
+        <w:rPr>
+          <w:b/>
+          <w:bCs/>
+        </w:rPr>
+        <w:t xml:space="preserve">Schopenhauer. </w:t>
+      </w:r>
+      <w:r>
+        <w:t xml:space="preserve">Es la influencia que más le marca. En El mundo como voluntad y representación, Schopenhauer dice que por debajo de la razón lo que mueve al hombre y a toda la realidad es una voluntad ciega e irracional. Nietzsche recoge esta idea de que lo primero no es la razón sino la voluntad, pero le da la vuelta: Schopenhauer era pesimista y proponía negar esa voluntad, mientras que Nietzsche propone afirmarla. Para él la voluntad no es voluntad de vivir, sino voluntad de poder.</w:t>
+      </w:r>
+    </w:p>
+    <w:p>
+      <w:pPr>
+        <w:spacing w:after="160" w:line="360"/>
+        <w:jc w:val="both"/>
+      </w:pPr>
+      <w:r>
+        <w:rPr>
+          <w:b/>
+          <w:bCs/>
+        </w:rPr>
+        <w:t xml:space="preserve">Wagner. </w:t>
+      </w:r>
+      <w:r>
+        <w:t xml:space="preserve">Nietzsche tuvo un proyecto junto a él: veía en la ópera de Wagner un renacer del arte trágico griego, un arte que expresara la fuerza de la vida. Pero rompieron cuando Wagner se volvió hacia temas cristianos, que Nietzsche consideraba una forma de decadencia.</w:t>
+      </w:r>
+    </w:p>
+    <w:p>
+      <w:pPr>
+        <w:spacing w:after="160" w:line="360"/>
+        <w:jc w:val="both"/>
+      </w:pPr>
+      <w:r>
+        <w:rPr>
+          <w:b/>
+          <w:bCs/>
+        </w:rPr>
+        <w:t xml:space="preserve">Sócrates y Platón. </w:t>
+      </w:r>
+      <w:r>
+        <w:t xml:space="preserve">Como filólogo, Nietzsche admiraba a los griegos anteriores a Sócrates. Para él la enfermedad de Occidente empieza con Sócrates y Platón, que pusieron la razón y un mundo de las ideas por encima de la vida y de este mundo. Se pregunta si no fue Sócrates el verdadero corruptor de la juventud y si no mereció la cicuta. Y dice que el cristianismo es platonismo para el pueblo: el cristianismo repite la idea de Platón de que hay otro mundo mejor que este, pero para todos.</w:t>
+      </w:r>
+    </w:p>
+    <w:p>
+      <w:pPr>
+        <w:spacing w:after="160" w:line="360"/>
+        <w:jc w:val="both"/>
+      </w:pPr>
+      <w:r>
+        <w:rPr>
+          <w:b/>
+          <w:bCs/>
+        </w:rPr>
+        <w:t xml:space="preserve">Darwin. </w:t>
+      </w:r>
+      <w:r>
+        <w:t xml:space="preserve">En la época de Nietzsche el evolucionismo de Darwin (lucha por la supervivencia, supervivencia de los más adaptados) y el darwinismo social de Spencer estaban muy presentes. Nietzsche comparte la idea de que el hombre es un ser vivo más y que la vida es lucha, pero dice que lo que mueve la vida no es sobrevivir, sino tener cada vez más poder.</w:t>
+      </w:r>
+    </w:p>
+    <w:p>
+      <w:pPr>
+        <w:spacing w:after="160" w:line="360"/>
+        <w:jc w:val="both"/>
+      </w:pPr>
+      <w:r>
+        <w:rPr>
+          <w:b/>
+          <w:bCs/>
+        </w:rPr>
+        <w:t xml:space="preserve">El cristianismo luterano. </w:t>
+      </w:r>
+      <w:r>
+        <w:t xml:space="preserve">Nietzsche se crió en una casa de pastor protestante, y gran parte de su obra es una lucha contra ese cristianismo, al que considera la raíz de todos los males de Europa.</w:t>
       </w:r>
     </w:p>
     <w:p>
@@ -98,61 +160,183 @@
         <w:pStyle w:val="Heading1"/>
       </w:pPr>
       <w:r>
-        <w:t xml:space="preserve">3. Síntesis de su doctrina</w:t>
-      </w:r>
-    </w:p>
-    <w:p>
-      <w:pPr>
-        <w:spacing w:after="160" w:line="360"/>
-        <w:jc w:val="both"/>
-      </w:pPr>
-      <w:r>
-        <w:t xml:space="preserve">Nietzsche defiende el vitalismo: lo bueno es lo que eleva la vida. Para él el mundo contemporáneo es el horror. En La genealogía de la moral (1887) se pregunta de dónde vienen las palabras bueno y malo. Los buenos eran los aristócratas, los nobles que tienen poder: viven con confianza y franqueza, no se toman en serio sus contratiempos e incluso respetan a sus enemigos. Los malos son los débiles, los hombres del resentimiento: no son francos, miran de reojo, no olvidan y esperan. Como no pueden vengarse con la acción, se vengan inventando valores: llaman malo al fuerte y bueno al humilde y al que sufre. Es la rebelión de los esclavos en la moral.</w:t>
-      </w:r>
-    </w:p>
-    <w:p>
-      <w:pPr>
-        <w:spacing w:after="160" w:line="360"/>
-        <w:jc w:val="both"/>
-      </w:pPr>
-      <w:r>
-        <w:t xml:space="preserve">Según Nietzsche esa moral viene del pueblo sacerdotal judío y lo peor del judaísmo es el cristianismo, que con su amor a los pobres y a los débiles es el cebo más peligroso. Frente a Judea estaba Roma, los fuertes. Pero ganó Judea: con el cristianismo, después con la Reforma protestante, después con la Revolución francesa y al final con el liberalismo y el socialismo. (Ojo: él no era antisemita político, despreciaba a los antisemitas de su época.)</w:t>
-      </w:r>
-    </w:p>
-    <w:p>
-      <w:pPr>
-        <w:spacing w:after="160" w:line="360"/>
-        <w:jc w:val="both"/>
-      </w:pPr>
-      <w:r>
-        <w:t xml:space="preserve">Propone un nuevo bien y mal (El Anticristo): bueno es todo lo que eleva el sentimiento de poder y malo todo lo que viene de la debilidad. La compasión es el peor vicio. Incluso escribe una Ley contra el cristianismo: vicio = cristiano.</w:t>
-      </w:r>
-    </w:p>
-    <w:p>
-      <w:pPr>
-        <w:spacing w:after="160" w:line="360"/>
-        <w:jc w:val="both"/>
-      </w:pPr>
-      <w:r>
-        <w:t xml:space="preserve">En La gaya ciencia aparece la parábola del loco que busca a Dios con una linterna en pleno día: "¡Dios ha muerto y lo hemos matado nosotros!". Ya no hay nada que dé sentido, y eso es el nihilismo. Muchos filósofos tenían voluntad de verdad, pero detrás de ella está la voluntad de poder, que no es solo querer vivir sino querer ir siempre más allá.</w:t>
-      </w:r>
-    </w:p>
-    <w:p>
-      <w:pPr>
-        <w:spacing w:after="160" w:line="360"/>
-        <w:jc w:val="both"/>
-      </w:pPr>
-      <w:r>
-        <w:t xml:space="preserve">En Así habló Zaratustra explica las tres transformaciones del espíritu: el camello carga con el "tú debes", el león lucha contra él y dice "yo quiero", y el niño crea sus propios valores (inocencia, juego, un santo decir sí). La meta es el superhombre: el hombre es una cuerda entre el animal y el superhombre, un puente y no una meta.</w:t>
-      </w:r>
-    </w:p>
-    <w:p>
-      <w:pPr>
-        <w:spacing w:after="160" w:line="360"/>
-        <w:jc w:val="both"/>
-      </w:pPr>
-      <w:r>
-        <w:t xml:space="preserve">Por último está el eterno retorno: ¿qué dirías si un demonio te dijera que vas a vivir tu vida mil veces igual? Si reaccionas mal eres un débil; si te parece buena idea vas camino de ser un superhombre. Según tu reacción se mide cómo vas.</w:t>
+        <w:t xml:space="preserve">3. Doctrina de Nietzsche</w:t>
+      </w:r>
+    </w:p>
+    <w:p>
+      <w:pPr>
+        <w:spacing w:after="160" w:line="360"/>
+        <w:jc w:val="both"/>
+      </w:pPr>
+      <w:r>
+        <w:rPr>
+          <w:b/>
+          <w:bCs/>
+        </w:rPr>
+        <w:t xml:space="preserve">El vitalismo. </w:t>
+      </w:r>
+      <w:r>
+        <w:t xml:space="preserve">Nietzsche defiende el vitalismo: lo bueno es lo que eleva la vida. Por eso ve el mundo contemporáneo como el horror, porque cree que la cultura europea, desde Platón y el cristianismo, ha ido en contra de la vida.</w:t>
+      </w:r>
+    </w:p>
+    <w:p>
+      <w:pPr>
+        <w:spacing w:after="160" w:line="360"/>
+        <w:jc w:val="both"/>
+      </w:pPr>
+      <w:r>
+        <w:rPr>
+          <w:b/>
+          <w:bCs/>
+        </w:rPr>
+        <w:t xml:space="preserve">El bien y el mal: señores y esclavos. </w:t>
+      </w:r>
+      <w:r>
+        <w:t xml:space="preserve">En La genealogía de la moral (1887) Nietzsche se pregunta de dónde vienen las palabras bueno y malo. Al principio los buenos eran los aristócratas, los que tienen poder. El hombre noble vive con confianza y franqueza frente a sí mismo, no se toma mucho tiempo en serio sus contratiempos porque tiene tanta fuerza que también olvida, y hasta respeta a sus enemigos y solo quiere uno que sea digno de él. Los nobles eran felices sin tener que convencerse de ello, y para ellos actuar y ser felices era lo mismo. Frente a ellos están los débiles, los oprimidos, los hombres del resentimiento. Para ellos la felicidad es algo pasivo: descanso, aturdimiento. El hombre del resentimiento no es franco ni honesto consigo mismo: su alma mira de reojo, ama los escondites y los caminos tortuosos, sabe callar, no olvidar y esperar. Por eso acaba siendo más inteligente que el noble.</w:t>
+      </w:r>
+    </w:p>
+    <w:p>
+      <w:pPr>
+        <w:spacing w:after="160" w:line="360"/>
+        <w:jc w:val="both"/>
+      </w:pPr>
+      <w:r>
+        <w:rPr>
+          <w:b/>
+          <w:bCs/>
+        </w:rPr>
+        <w:t xml:space="preserve">La rebelión de los esclavos en la moral. </w:t>
+      </w:r>
+      <w:r>
+        <w:t xml:space="preserve">Como los débiles no pueden vengarse con la acción, se vengan de forma imaginaria: el resentimiento se vuelve creador y crea valores. Llaman malo al fuerte y bueno al humilde, al pobre y al que sufre. Por eso su moral es siempre reacción, necesita a alguien a quien decir que no. La moral noble, en cambio, actúa y nace de sí misma: nosotros los nobles, nosotros los buenos, nosotros los bellos, nosotros los felices.</w:t>
+      </w:r>
+    </w:p>
+    <w:p>
+      <w:pPr>
+        <w:spacing w:after="160" w:line="360"/>
+        <w:jc w:val="both"/>
+      </w:pPr>
+      <w:r>
+        <w:rPr>
+          <w:b/>
+          <w:bCs/>
+        </w:rPr>
+        <w:t xml:space="preserve">Judea contra Roma: el cristianismo. </w:t>
+      </w:r>
+      <w:r>
+        <w:t xml:space="preserve">Para Nietzsche esta moral de esclavos viene del pueblo judío, que había extendido la religión, y lo peor del judaísmo es el cristianismo. Jesús, con su amor a los pobres, a los enfermos y a los pecadores, es para él el cebo más peligroso de esa venganza. Frente a Judea estaba Roma, los fuertes y los nobles. Pero ganó Judea, primero con el cristianismo. En el Renacimiento volvió el ideal clásico, pero el cristianismo fue llevado a peor con el protestantismo, y después con la Revolución francesa, en la que la última nobleza de Europa cayó bajo el resentimiento del pueblo. El último paso es el liberalismo, y también el socialismo y el anarquismo: el cristiano y el anarquista son, para él, los dos decadentes. (No hay que confundir esto con un antisemitismo político: Nietzsche despreciaba a los antisemitas de su época.)</w:t>
+      </w:r>
+    </w:p>
+    <w:p>
+      <w:pPr>
+        <w:spacing w:after="160" w:line="360"/>
+        <w:jc w:val="both"/>
+      </w:pPr>
+      <w:r>
+        <w:rPr>
+          <w:b/>
+          <w:bCs/>
+        </w:rPr>
+        <w:t xml:space="preserve">Un nuevo concepto de bien y mal. </w:t>
+      </w:r>
+      <w:r>
+        <w:t xml:space="preserve">En El Anticristo Nietzsche propone otra moral: bueno es todo lo que eleva en el hombre el sentimiento de poder, la voluntad de poder, el poder mismo. Malo es todo lo que viene de la debilidad. La felicidad es el sentimiento de que el poder crece, de haber superado una resistencia. No quiere paz, sino guerra; no virtud, sino habilidad. Y llega a decir que los débiles y los fracasados deben perecer, y que la compasión, que es lo que enseña el cristianismo, es peor que cualquier vicio.</w:t>
+      </w:r>
+    </w:p>
+    <w:p>
+      <w:pPr>
+        <w:spacing w:after="160" w:line="360"/>
+        <w:jc w:val="both"/>
+      </w:pPr>
+      <w:r>
+        <w:rPr>
+          <w:b/>
+          <w:bCs/>
+        </w:rPr>
+        <w:t xml:space="preserve">Dios ha muerto. </w:t>
+      </w:r>
+      <w:r>
+        <w:t xml:space="preserve">En La gaya ciencia aparece la parábola del loco. Un loco va con una linterna encendida en pleno día por la plaza gritando "¡busco a Dios!", y la gente que no cree en Dios se ríe de él. Entonces el loco les dice: "¡Dios ha muerto y lo hemos matado nosotros!". Y se pregunta: ¿cómo hemos podido vaciar el mar?, ¿sigue habiendo un arriba y un abajo?, ¿no vamos errando por una nada infinita? Que Dios ha muerto significa que Europa ya no cree en lo que daba sentido a todo, la verdad, la moral, el orden del mundo, pero todavía no se ha dado cuenta de lo que eso supone. El resultado es el nihilismo: nada vale nada. El hombre moderno se vuelve cada vez más débil, más mediocre, más cristiano, y estamos cansados del hombre.</w:t>
+      </w:r>
+    </w:p>
+    <w:p>
+      <w:pPr>
+        <w:spacing w:after="160" w:line="360"/>
+        <w:jc w:val="both"/>
+      </w:pPr>
+      <w:r>
+        <w:rPr>
+          <w:b/>
+          <w:bCs/>
+        </w:rPr>
+        <w:t xml:space="preserve">Voluntad de verdad y voluntad de poder. </w:t>
+      </w:r>
+      <w:r>
+        <w:t xml:space="preserve">Muchos pensadores han tenido una voluntad de verdad, pero para Nietzsche los que buscan la verdad son incapaces de ver el mundo como es. Se pregunta: ¿por qué queremos la verdad y no, más bien, la no verdad, la incertidumbre o la ignorancia? Todo el dogmatismo de los filósofos ha sido una noble puerilidad, porque la mayor parte de su pensar está guiada en secreto por sus instintos. Lo que hay detrás de todo es la voluntad de poder: en todos los seres vivos hay voluntad de poder, incluso en el que sirve hay voluntad de ser señor. No es solo voluntad de vivir, sino de ir siempre más allá, de crecer. Por eso no existen un bien y un mal eternos: quien quiere crear valores tiene que destruir antes los anteriores.</w:t>
+      </w:r>
+    </w:p>
+    <w:p>
+      <w:pPr>
+        <w:spacing w:after="160" w:line="360"/>
+        <w:jc w:val="both"/>
+      </w:pPr>
+      <w:r>
+        <w:rPr>
+          <w:b/>
+          <w:bCs/>
+        </w:rPr>
+        <w:t xml:space="preserve">Las tres transformaciones. </w:t>
+      </w:r>
+      <w:r>
+        <w:t xml:space="preserve">En Así habló Zaratustra Nietzsche explica el camino del espíritu con tres transformaciones. Primero el espíritu se convierte en camello, que carga con todo lo pesado, las normas y la moral, y se va con su carga al desierto. En el desierto el camello se convierte en león, que quiere conquistar su libertad y lucha contra el gran dragón, que se llama "tú debes"; frente a él, el león dice "yo quiero". Pero el león todavía tiene que convertirse en niño, porque el niño es inocencia, olvido, un nuevo comienzo, un juego, un santo decir sí. El niño ya no solo destruye los valores antiguos, sino que crea los suyos.</w:t>
+      </w:r>
+    </w:p>
+    <w:p>
+      <w:pPr>
+        <w:spacing w:after="160" w:line="360"/>
+        <w:jc w:val="both"/>
+      </w:pPr>
+      <w:r>
+        <w:rPr>
+          <w:b/>
+          <w:bCs/>
+        </w:rPr>
+        <w:t xml:space="preserve">El superhombre. </w:t>
+      </w:r>
+      <w:r>
+        <w:t xml:space="preserve">Es la idea más importante. En Así habló Zaratustra, Zaratustra dice: "¡Mirad, yo os enseño al superhombre! El superhombre es el sentido de la tierra". Les pide a todos que permanezcan fieles a la tierra y que no crean a los que hablan de esperanzas en otro mundo, porque son despreciadores de la vida. Como Dios ha muerto, ya no hay un más allá que dé sentido a la vida, y el sentido tiene que estar aquí. El hombre es una cuerda tendida entre el animal y el superhombre, una cuerda sobre el abismo. La grandeza del hombre está en ser un puente y no una meta. El superhombre es el que llega al final de las tres transformaciones: el que, después de la muerte de Dios, crea sus propios valores, afirma la vida tal como es y vive según su voluntad de poder. Es lo contrario del hombre del resentimiento y del cristiano, que para Nietzsche representa el mundo de la nada chocando con el superhombre.</w:t>
+      </w:r>
+    </w:p>
+    <w:p>
+      <w:pPr>
+        <w:spacing w:after="160" w:line="360"/>
+        <w:jc w:val="both"/>
+      </w:pPr>
+      <w:r>
+        <w:rPr>
+          <w:b/>
+          <w:bCs/>
+        </w:rPr>
+        <w:t xml:space="preserve">El eterno retorno. </w:t>
+      </w:r>
+      <w:r>
+        <w:t xml:space="preserve">En La gaya ciencia Nietzsche propone una posibilidad: ¿qué dirías si un día un demonio se metiera en tu soledad y te dijera que esta vida, tal como la estás viviendo, tendrás que vivirla otra vez y un número infinito de veces, sin nada nuevo, con cada dolor y cada placer en el mismo orden? ¿Te tirarías al suelo maldiciendo al demonio, o le contestarías "eres un dios, nunca he oído nada más divino"? La vida se repite en bucle, y lo importante es la reacción. Si reaccionas mal, eres un débil. Si te parece una buena idea, significa que estás en el camino de ser un superhombre, porque solo quien dice sí a toda su vida podría querer repetirla. Dependiendo de tu reacción se mide cómo vas.</w:t>
+      </w:r>
+    </w:p>
+    <w:p>
+      <w:pPr>
+        <w:spacing w:after="160" w:line="360"/>
+        <w:jc w:val="both"/>
+      </w:pPr>
+      <w:r>
+        <w:rPr>
+          <w:b/>
+          <w:bCs/>
+        </w:rPr>
+        <w:t xml:space="preserve">La ley contra el cristianismo. </w:t>
+      </w:r>
+      <w:r>
+        <w:t xml:space="preserve">Al final de El Anticristo Nietzsche escribe una ley contra el cristianismo en la que declara la guerra a muerte contra el vicio, y el vicio es el cristianismo. Dice que el sacerdote es el tipo de persona más vicioso porque enseña lo antinatural, que predicar la castidad es una incitación a lo antinatural y que palabras como Dios, salvador o santo deberían usarse como insultos. Termina pidiendo una transmutación de todos los valores.</w:t>
       </w:r>
     </w:p>
     <w:p>
@@ -160,25 +344,55 @@
         <w:pStyle w:val="Heading1"/>
       </w:pPr>
       <w:r>
-        <w:t xml:space="preserve">4. Relación con Sartre</w:t>
-      </w:r>
-    </w:p>
-    <w:p>
-      <w:pPr>
-        <w:spacing w:after="160" w:line="360"/>
-        <w:jc w:val="both"/>
-      </w:pPr>
-      <w:r>
-        <w:t xml:space="preserve">Sartre parte de la muerte de Dios de Nietzsche: si Dios no existe, nadie ha pensado una naturaleza humana. Para los dos no hay valores dados sino que el hombre los crea, y el hombre es algo que se hace (un puente para Nietzsche, un proyecto para Sartre). El niño que crea valores se parece al hombre de Sartre que al elegir se elige a sí mismo.</w:t>
-      </w:r>
-    </w:p>
-    <w:p>
-      <w:pPr>
-        <w:spacing w:after="160" w:line="360"/>
-        <w:jc w:val="both"/>
-      </w:pPr>
-      <w:r>
-        <w:t xml:space="preserve">La diferencia es que Sartre dice que al elegirme elijo para toda la humanidad, mientras Nietzsche es aristocrático y desprecia la igualdad. Además Sartre vive la ausencia de Dios con angustia y náusea y Nietzsche quiere decir sí a la vida.</w:t>
+        <w:t xml:space="preserve">4. Relación con otros autores</w:t>
+      </w:r>
+    </w:p>
+    <w:p>
+      <w:pPr>
+        <w:spacing w:after="160" w:line="360"/>
+        <w:jc w:val="both"/>
+      </w:pPr>
+      <w:r>
+        <w:rPr>
+          <w:b/>
+          <w:bCs/>
+        </w:rPr>
+        <w:t xml:space="preserve">Nietzsche y Freud. </w:t>
+      </w:r>
+      <w:r>
+        <w:t xml:space="preserve">Los dos son maestros de la sospecha. Nietzsche ya dice que la mayor parte del pensar consciente está guiada por los instintos, y Freud lo convierte en una teoría con el inconsciente y el ello, una palabra que viene de Nietzsche. Para los dos la moral es algo que hay que desenmascarar: para Nietzsche es el resentimiento de los débiles y para Freud el superyó, las normas interiorizadas. Los dos ven la culpa como agresividad que no se puede descargar hacia fuera y se vuelve contra uno mismo. Y los dos critican la religión: Dios ha muerto para Nietzsche y es una ilusión para Freud. La diferencia es que Nietzsche quiere liberar los instintos y afirmar la vida, y Freud quiere que el yo controle las pulsiones.</w:t>
+      </w:r>
+    </w:p>
+    <w:p>
+      <w:pPr>
+        <w:spacing w:after="160" w:line="360"/>
+        <w:jc w:val="both"/>
+      </w:pPr>
+      <w:r>
+        <w:rPr>
+          <w:b/>
+          <w:bCs/>
+        </w:rPr>
+        <w:t xml:space="preserve">Nietzsche y Marx. </w:t>
+      </w:r>
+      <w:r>
+        <w:t xml:space="preserve">También comparten la sospecha: detrás de la moral y la religión hay algo oculto, la voluntad de poder para Nietzsche y los intereses económicos de la clase dominante para Marx. Los dos critican la religión: para Marx es el opio del pueblo. Pero están en lados opuestos: Marx defiende a los oprimidos y quiere una sociedad sin clases, mientras que para Nietzsche el socialismo es una forma más del resentimiento de los débiles, igual que el cristianismo.</w:t>
+      </w:r>
+    </w:p>
+    <w:p>
+      <w:pPr>
+        <w:spacing w:after="160" w:line="360"/>
+        <w:jc w:val="both"/>
+      </w:pPr>
+      <w:r>
+        <w:rPr>
+          <w:b/>
+          <w:bCs/>
+        </w:rPr>
+        <w:t xml:space="preserve">Nietzsche y Sartre. </w:t>
+      </w:r>
+      <w:r>
+        <w:t xml:space="preserve">Sartre parte de la muerte de Dios de Nietzsche: si Dios no existe, nadie ha pensado una naturaleza humana, y el hombre está solo con su libertad. Para los dos no hay valores dados, sino que el hombre los crea, y el hombre es algo que se hace: un puente para Nietzsche y un proyecto para Sartre. El niño de las tres transformaciones se parece al hombre de Sartre, que al elegir se elige a sí mismo. La diferencia es que Sartre dice que al elegirme elijo para toda la humanidad, mientras que Nietzsche es aristocrático y desprecia la igualdad. Además Sartre vive la ausencia de Dios con angustia y náusea, y Nietzsche quiere responder con un sí a la vida.</w:t>
       </w:r>
     </w:p>
     <w:p>
@@ -195,34 +409,52 @@
         <w:jc w:val="both"/>
       </w:pPr>
       <w:r>
-        <w:t xml:space="preserve">Nietzsche acierta al criticar la hipocresía y la mediocridad. Pero su propuesta no se puede asumir. Si toda verdad es solo voluntad de poder, lo que él dice tampoco sería verdad.</w:t>
-      </w:r>
-    </w:p>
-    <w:p>
-      <w:pPr>
-        <w:spacing w:after="160" w:line="360"/>
-        <w:jc w:val="both"/>
-      </w:pPr>
-      <w:r>
-        <w:t xml:space="preserve">Volvemos a la pregunta: ¿qué es un ser humano? Si uno observa la escala de los seres sin prejuicios, los inertes son, los vivos son y viven, y los humanos son, viven y entienden. La vida es la manera de ser de los seres vivos, no una fuerza ciega. ¿Solo los seres humanos tenemos finalidades? Todo ser vivo se mueve hacia su propio bien. El poder es un medio, se quiere poder para algo. El fin de la vida humana no es el poder ni la libertad, es la felicidad. Y lo importante es que el ser humano puede optar.</w:t>
-      </w:r>
-    </w:p>
-    <w:p>
-      <w:pPr>
-        <w:spacing w:after="160" w:line="360"/>
-        <w:jc w:val="both"/>
-      </w:pPr>
-      <w:r>
-        <w:t xml:space="preserve">Si aceptamos su moral, el valor de una persona depende de su fuerza: "los débiles deben perecer". Eso se parece al darwinismo social, a la eugenesia y a lo que después hicieron los nazis con su obra, y hoy a Peter Singer cuando dice que hay seres humanos que no son personas.</w:t>
-      </w:r>
-    </w:p>
-    <w:p>
-      <w:pPr>
-        <w:spacing w:after="160" w:line="360"/>
-        <w:jc w:val="both"/>
-      </w:pPr>
-      <w:r>
-        <w:t xml:space="preserve">Ser humano es todo miembro de la especie homo sapiens sapiens. Persona es un ser único e irrepetible con dignidad. La palabra viene del teatro y en Roma solo eran personas los hombres libres, romanos y paterfamilias, una sociedad como la que Nietzsche admiraba. Santo Tomás coge la definición de Boecio: sustancia individual de naturaleza racional. Si la persona va unida al ser, su dignidad no depende de la fuerza ni de la salud: es una dignidad ontológica, que se tiene por el simple hecho de ser.</w:t>
+        <w:t xml:space="preserve">Desde mi punto de vista, Nietzsche acierta al criticar la hipocresía y la mediocridad, y su retrato del hombre noble, franco y que respeta a su enemigo tiene algo admirable. Pero su propuesta no se puede asumir, y la primera razón está en su propio planteamiento. Nietzsche dice que todo nuestro pensamiento está guiado por los instintos, que la voluntad de verdad es solo voluntad de poder. Pero si todo lo que pensamos está determinado por nuestros instintos y sentimientos, ¿por qué escribe libros para convencernos? Escribir para convencer a alguien supone que el lector puede razonar, entender los argumentos y cambiar de opinión libremente. Es decir, Nietzsche niega con sus palabras la razón y la libertad que usa al escribir.</w:t>
+      </w:r>
+    </w:p>
+    <w:p>
+      <w:pPr>
+        <w:spacing w:after="160" w:line="360"/>
+        <w:jc w:val="both"/>
+      </w:pPr>
+      <w:r>
+        <w:t xml:space="preserve">La segunda razón es su idea de la virtud. Nietzsche dice: no virtud, sino habilidad. Pero para Aristóteles la virtud es un hábito: una disposición que se adquiere repitiendo buenos actos, que se convierte en una segunda naturaleza y que nos hace mejores. Nadie nace valiente o justo; uno se hace valiente actuando con valentía. Esto muestra que el ser humano no está simplemente movido por sus instintos, sino que puede formarse a sí mismo, educar sus impulsos y elegir. Lo importante es saber que el ser humano puede optar.</w:t>
+      </w:r>
+    </w:p>
+    <w:p>
+      <w:pPr>
+        <w:spacing w:after="160" w:line="360"/>
+        <w:jc w:val="both"/>
+      </w:pPr>
+      <w:r>
+        <w:t xml:space="preserve">Por eso hay que volver a la pregunta: ¿qué es el ser humano? Un ser racional y libre. Si observamos la escala de los seres sin prejuicios, los seres inertes son; los seres vivos son y viven; y los seres humanos son, viven y entienden. La vida es la manera de ser de los seres vivos, no una fuerza ciega añadida a ellos. ¿Solo los seres humanos tenemos finalidades? Todo ser vivo tiende a su propio bien, pero el ser humano además conoce su fin y lo elige. Y el fin de la vida humana no es el poder, ni siquiera la libertad, sino la felicidad. El poder es solo un medio: siempre se quiere poder para algo.</w:t>
+      </w:r>
+    </w:p>
+    <w:p>
+      <w:pPr>
+        <w:spacing w:after="160" w:line="360"/>
+        <w:jc w:val="both"/>
+      </w:pPr>
+      <w:r>
+        <w:t xml:space="preserve">Esto tiene consecuencias graves para la concepción del ser humano. Si lo bueno es lo que aumenta el poder y los débiles deben perecer, el valor de una persona depende de su fuerza. El enfermo, el anciano o el discapacitado valdrían menos. Es lo mismo que defendían el darwinismo social, la eugenesia de Galton y el racismo, y lo que después se hizo con la obra de Nietzsche en el nazismo. Hoy se ve en autores como Peter Singer, que distingue entre seres humanos que son personas y otros que no lo son.</w:t>
+      </w:r>
+    </w:p>
+    <w:p>
+      <w:pPr>
+        <w:spacing w:after="160" w:line="360"/>
+        <w:jc w:val="both"/>
+      </w:pPr>
+      <w:r>
+        <w:t xml:space="preserve">Ser humano es todo miembro de la especie homo sapiens sapiens. Persona es un ser único e irrepetible, con dignidad. La palabra viene del teatro, donde la persona era la máscara o el personaje, y antiguamente no todos se consideraban personas: en Roma solo el hombre libre, romano y paterfamilias, una sociedad aristocrática como la que Nietzsche admiraba. Fue precisamente el cristianismo, que él tanto desprecia, el que amplió el concepto a todos. Santo Tomás de Aquino coge la definición de Boecio: persona es una sustancia individual de naturaleza racional.</w:t>
+      </w:r>
+    </w:p>
+    <w:p>
+      <w:pPr>
+        <w:spacing w:after="160" w:line="360"/>
+        <w:jc w:val="both"/>
+      </w:pPr>
+      <w:r>
+        <w:t xml:space="preserve">Por tanto la persona va necesariamente unida al ser, y de ahí existe la dignidad humana: sin ser no existe. Es una dignidad ontológica, que no depende de la fuerza, de la salud ni del poder, sino que se tiene por el simple hecho de ser. Los seres humanos somos racionales y libres, y nuestra vida tiene como fin la felicidad.</w:t>
       </w:r>
     </w:p>
     <w:p>
@@ -248,6 +480,19 @@
         <w:spacing w:after="100" w:line="320"/>
       </w:pPr>
       <w:r>
+        <w:t xml:space="preserve">Maestro de la sospecha (Ricoeur): lo oculto es la voluntad de poder.</w:t>
+      </w:r>
+    </w:p>
+    <w:p>
+      <w:pPr>
+        <w:pStyle w:val="ListParagraph"/>
+        <w:numPr>
+          <w:ilvl w:val="0"/>
+          <w:numId w:val="2"/>
+        </w:numPr>
+        <w:spacing w:after="100" w:line="320"/>
+      </w:pPr>
+      <w:r>
         <w:t xml:space="preserve">Contexto: caída del Sacro Imperio (1806), Prusia vs Austria, Bismarck, II Reich en Versalles (1871).</w:t>
       </w:r>
     </w:p>
@@ -261,85 +506,176 @@
         <w:spacing w:after="100" w:line="320"/>
       </w:pPr>
       <w:r>
-        <w:t xml:space="preserve">Bio: hijo de pastor luterano, huérfano a los 4, criado por mujeres, filología, Basilea, Wagner, colapso en Turín (1889), su hermana manipula su obra.</w:t>
-      </w:r>
-    </w:p>
-    <w:p>
-      <w:pPr>
-        <w:pStyle w:val="ListParagraph"/>
-        <w:numPr>
-          <w:ilvl w:val="0"/>
-          <w:numId w:val="2"/>
-        </w:numPr>
-        <w:spacing w:after="100" w:line="320"/>
-      </w:pPr>
-      <w:r>
-        <w:t xml:space="preserve">Influencias: Schopenhauer (voluntad), Wagner, Grecia trágica, Heráclito. Cristianismo = platonismo para el pueblo.</w:t>
-      </w:r>
-    </w:p>
-    <w:p>
-      <w:pPr>
-        <w:pStyle w:val="ListParagraph"/>
-        <w:numPr>
-          <w:ilvl w:val="0"/>
-          <w:numId w:val="2"/>
-        </w:numPr>
-        <w:spacing w:after="100" w:line="320"/>
-      </w:pPr>
-      <w:r>
-        <w:t xml:space="preserve">Vitalismo. Buenos = aristócratas con poder. Malos = débiles, resentimiento → inventan valores.</w:t>
-      </w:r>
-    </w:p>
-    <w:p>
-      <w:pPr>
-        <w:pStyle w:val="ListParagraph"/>
-        <w:numPr>
-          <w:ilvl w:val="0"/>
-          <w:numId w:val="2"/>
-        </w:numPr>
-        <w:spacing w:after="100" w:line="320"/>
-      </w:pPr>
-      <w:r>
-        <w:t xml:space="preserve">Judea vs Roma: cristianismo → protestantismo → Revolución francesa → liberalismo.</w:t>
-      </w:r>
-    </w:p>
-    <w:p>
-      <w:pPr>
-        <w:pStyle w:val="ListParagraph"/>
-        <w:numPr>
-          <w:ilvl w:val="0"/>
-          <w:numId w:val="2"/>
-        </w:numPr>
-        <w:spacing w:after="100" w:line="320"/>
-      </w:pPr>
-      <w:r>
-        <w:t xml:space="preserve">Dios ha muerto (parábola del loco) → nihilismo. Voluntad de verdad vs voluntad de poder.</w:t>
-      </w:r>
-    </w:p>
-    <w:p>
-      <w:pPr>
-        <w:pStyle w:val="ListParagraph"/>
-        <w:numPr>
-          <w:ilvl w:val="0"/>
-          <w:numId w:val="2"/>
-        </w:numPr>
-        <w:spacing w:after="100" w:line="320"/>
-      </w:pPr>
-      <w:r>
-        <w:t xml:space="preserve">Camello → león → niño → superhombre. Eterno retorno.</w:t>
-      </w:r>
-    </w:p>
-    <w:p>
-      <w:pPr>
-        <w:pStyle w:val="ListParagraph"/>
-        <w:numPr>
-          <w:ilvl w:val="0"/>
-          <w:numId w:val="2"/>
-        </w:numPr>
-        <w:spacing w:after="100" w:line="320"/>
-      </w:pPr>
-      <w:r>
-        <w:t xml:space="preserve">Crítica: se contradice; escala de los seres; el fin es la felicidad; el hombre puede optar; persona → dignidad ontológica.</w:t>
+        <w:t xml:space="preserve">Bio: hijo de pastor luterano, huérfano a los 4, criado por mujeres; filología en Leipzig y Bonn; Schopenhauer (1865); Basilea (1869); Wagner (Tribschen); jubilación (1879); colapso en Turín (1889); muere en Weimar (1900).</w:t>
+      </w:r>
+    </w:p>
+    <w:p>
+      <w:pPr>
+        <w:pStyle w:val="ListParagraph"/>
+        <w:numPr>
+          <w:ilvl w:val="0"/>
+          <w:numId w:val="2"/>
+        </w:numPr>
+        <w:spacing w:after="100" w:line="320"/>
+      </w:pPr>
+      <w:r>
+        <w:t xml:space="preserve">Obras: El nacimiento de la tragedia (1872), La gaya ciencia (1882), Así habló Zaratustra (1883-85), Más allá del bien y del mal (1886), La genealogía de la moral (1887), El Anticristo (1888).</w:t>
+      </w:r>
+    </w:p>
+    <w:p>
+      <w:pPr>
+        <w:pStyle w:val="ListParagraph"/>
+        <w:numPr>
+          <w:ilvl w:val="0"/>
+          <w:numId w:val="2"/>
+        </w:numPr>
+        <w:spacing w:after="100" w:line="320"/>
+      </w:pPr>
+      <w:r>
+        <w:t xml:space="preserve">Precedentes: Schopenhauer (voluntad → N. la afirma), Wagner, Sócrates y Platón (cristianismo = platonismo para el pueblo), Darwin, el luteranismo.</w:t>
+      </w:r>
+    </w:p>
+    <w:p>
+      <w:pPr>
+        <w:pStyle w:val="ListParagraph"/>
+        <w:numPr>
+          <w:ilvl w:val="0"/>
+          <w:numId w:val="2"/>
+        </w:numPr>
+        <w:spacing w:after="100" w:line="320"/>
+      </w:pPr>
+      <w:r>
+        <w:t xml:space="preserve">Vitalismo. Buenos = aristócratas con poder, francos. Malos = hombres del resentimiento.</w:t>
+      </w:r>
+    </w:p>
+    <w:p>
+      <w:pPr>
+        <w:pStyle w:val="ListParagraph"/>
+        <w:numPr>
+          <w:ilvl w:val="0"/>
+          <w:numId w:val="2"/>
+        </w:numPr>
+        <w:spacing w:after="100" w:line="320"/>
+      </w:pPr>
+      <w:r>
+        <w:t xml:space="preserve">Rebelión de los esclavos: el resentimiento crea valores. Judea vs Roma: cristianismo → protestantismo → Revolución francesa → liberalismo.</w:t>
+      </w:r>
+    </w:p>
+    <w:p>
+      <w:pPr>
+        <w:pStyle w:val="ListParagraph"/>
+        <w:numPr>
+          <w:ilvl w:val="0"/>
+          <w:numId w:val="2"/>
+        </w:numPr>
+        <w:spacing w:after="100" w:line="320"/>
+      </w:pPr>
+      <w:r>
+        <w:t xml:space="preserve">Nuevo bien/mal: bueno = lo que eleva el poder; no virtud sino habilidad; los débiles deben perecer.</w:t>
+      </w:r>
+    </w:p>
+    <w:p>
+      <w:pPr>
+        <w:pStyle w:val="ListParagraph"/>
+        <w:numPr>
+          <w:ilvl w:val="0"/>
+          <w:numId w:val="2"/>
+        </w:numPr>
+        <w:spacing w:after="100" w:line="320"/>
+      </w:pPr>
+      <w:r>
+        <w:t xml:space="preserve">Dios ha muerto (parábola del loco) → nihilismo.</w:t>
+      </w:r>
+    </w:p>
+    <w:p>
+      <w:pPr>
+        <w:pStyle w:val="ListParagraph"/>
+        <w:numPr>
+          <w:ilvl w:val="0"/>
+          <w:numId w:val="2"/>
+        </w:numPr>
+        <w:spacing w:after="100" w:line="320"/>
+      </w:pPr>
+      <w:r>
+        <w:t xml:space="preserve">Voluntad de verdad vs voluntad de poder.</w:t>
+      </w:r>
+    </w:p>
+    <w:p>
+      <w:pPr>
+        <w:pStyle w:val="ListParagraph"/>
+        <w:numPr>
+          <w:ilvl w:val="0"/>
+          <w:numId w:val="2"/>
+        </w:numPr>
+        <w:spacing w:after="100" w:line="320"/>
+      </w:pPr>
+      <w:r>
+        <w:t xml:space="preserve">Camello (tú debes) → león (yo quiero) → niño (crea valores).</w:t>
+      </w:r>
+    </w:p>
+    <w:p>
+      <w:pPr>
+        <w:pStyle w:val="ListParagraph"/>
+        <w:numPr>
+          <w:ilvl w:val="0"/>
+          <w:numId w:val="2"/>
+        </w:numPr>
+        <w:spacing w:after="100" w:line="320"/>
+      </w:pPr>
+      <w:r>
+        <w:t xml:space="preserve">Superhombre: sentido de la tierra; el hombre es un puente, no una meta.</w:t>
+      </w:r>
+    </w:p>
+    <w:p>
+      <w:pPr>
+        <w:pStyle w:val="ListParagraph"/>
+        <w:numPr>
+          <w:ilvl w:val="0"/>
+          <w:numId w:val="2"/>
+        </w:numPr>
+        <w:spacing w:after="100" w:line="320"/>
+      </w:pPr>
+      <w:r>
+        <w:t xml:space="preserve">Eterno retorno: el demonio; según tu reacción, débil o camino al superhombre.</w:t>
+      </w:r>
+    </w:p>
+    <w:p>
+      <w:pPr>
+        <w:pStyle w:val="ListParagraph"/>
+        <w:numPr>
+          <w:ilvl w:val="0"/>
+          <w:numId w:val="2"/>
+        </w:numPr>
+        <w:spacing w:after="100" w:line="320"/>
+      </w:pPr>
+      <w:r>
+        <w:t xml:space="preserve">Ley contra el cristianismo: vicio = cristianismo; transmutación de todos los valores.</w:t>
+      </w:r>
+    </w:p>
+    <w:p>
+      <w:pPr>
+        <w:pStyle w:val="ListParagraph"/>
+        <w:numPr>
+          <w:ilvl w:val="0"/>
+          <w:numId w:val="2"/>
+        </w:numPr>
+        <w:spacing w:after="100" w:line="320"/>
+      </w:pPr>
+      <w:r>
+        <w:t xml:space="preserve">Relaciones: Freud (instintos, moral, culpa, religión), Marx (sospecha; socialismo = resentimiento), Sartre (muerte de Dios, crear valores).</w:t>
+      </w:r>
+    </w:p>
+    <w:p>
+      <w:pPr>
+        <w:pStyle w:val="ListParagraph"/>
+        <w:numPr>
+          <w:ilvl w:val="0"/>
+          <w:numId w:val="2"/>
+        </w:numPr>
+        <w:spacing w:after="100" w:line="320"/>
+      </w:pPr>
+      <w:r>
+        <w:t xml:space="preserve">Crítica: si todo es instinto, ¿por qué escribe libros para convencernos?; virtud = hábito (Aristóteles); el hombre puede optar; escala de los seres; el fin es la felicidad; los débiles deben perecer → Singer; persona (Boecio) → dignidad ontológica.</w:t>
       </w:r>
     </w:p>
     <w:sectPr>

</xml_diff>

<commit_message>
Nietzsche: doctrina encadenada y comentario crítico más breve y argumentado
Co-Authored-By: Claude Opus 5.5 <noreply@anthropic.com>
Claude-Session: https://claude.ai/code/session_01Fj7SZp3YYQfX9U1XL9NLBt
</commit_message>
<xml_diff>
--- a/formacion-general/hombre-y-mundo-moderno/apuntes-word/Nietzsche.docx
+++ b/formacion-general/hombre-y-mundo-moderno/apuntes-word/Nietzsche.docx
@@ -169,14 +169,94 @@
         <w:jc w:val="both"/>
       </w:pPr>
       <w:r>
+        <w:t xml:space="preserve">El punto de partida de Nietzsche es el vitalismo: lo bueno es todo lo que afirma y eleva la vida. Desde ahí hace un diagnóstico muy duro de su época: la cultura europea, desde Platón y el cristianismo, ha ido en contra de la vida, y el resultado es un hombre cada vez más débil, más mediocre y más cansado. Para entender cómo se ha llegado hasta aquí, Nietzsche estudia el origen de nuestros valores en La genealogía de la moral (1887).</w:t>
+      </w:r>
+    </w:p>
+    <w:p>
+      <w:pPr>
+        <w:spacing w:after="160" w:line="360"/>
+        <w:jc w:val="both"/>
+      </w:pPr>
+      <w:r>
+        <w:t xml:space="preserve">Al principio, dice, los buenos eran los nobles, los aristócratas que tenían poder. Vivían con franqueza y confianza en sí mismos, no se tomaban en serio sus contratiempos y hasta respetaban a sus enemigos. Su moral nacía de ellos mismos: "nosotros los buenos, nosotros los felices". Frente a ellos estaban los débiles, que no podían vengarse con la acción y acumulaban resentimiento. Ese resentimiento acabó volviéndose creador: los débiles invirtieron los valores y empezaron a llamar malo al fuerte y bueno al humilde, al pobre y al que sufre. Es la rebelión de los esclavos en la moral, una moral que siempre es reacción contra otro.</w:t>
+      </w:r>
+    </w:p>
+    <w:p>
+      <w:pPr>
+        <w:spacing w:after="160" w:line="360"/>
+        <w:jc w:val="both"/>
+      </w:pPr>
+      <w:r>
+        <w:t xml:space="preserve">Para Nietzsche esta inversión la iniciaron los judíos y la extendió el cristianismo, con su amor a los débiles y su compasión, que él considera el peor de los vicios. La historia de Europa es la lucha entre Roma, los fuertes, y Judea, los débiles, y siempre ha ganado Judea: con el cristianismo, con el protestantismo, con la Revolución francesa y, por último, con el liberalismo y el socialismo. Por eso dice que el cristianismo es platonismo para el pueblo: los dos desprecian este mundo en nombre de otro mejor.</w:t>
+      </w:r>
+    </w:p>
+    <w:p>
+      <w:pPr>
+        <w:spacing w:after="160" w:line="360"/>
+        <w:jc w:val="both"/>
+      </w:pPr>
+      <w:r>
+        <w:t xml:space="preserve">Pero esa moral se ha quedado sin fundamento. En La gaya ciencia el loco anuncia que Dios ha muerto y que lo hemos matado nosotros: Europa ya no cree en lo que daba sentido a todo, aunque todavía no se ha dado cuenta. La consecuencia es el nihilismo, la sensación de que nada vale nada. Nietzsche no quiere volver atrás, sino aprovechar ese vacío para crear valores nuevos.</w:t>
+      </w:r>
+    </w:p>
+    <w:p>
+      <w:pPr>
+        <w:spacing w:after="160" w:line="360"/>
+        <w:jc w:val="both"/>
+      </w:pPr>
+      <w:r>
+        <w:t xml:space="preserve">Para ello desenmascara la voluntad de verdad de los filósofos. Detrás de su búsqueda de la verdad hay instintos, y detrás de todo lo vivo hay voluntad de poder: no un simple querer vivir, sino un querer crecer y superarse. De ahí su nueva moral: bueno es lo que aumenta el sentimiento de poder y malo lo que viene de la debilidad. Y quien quiera crear valores tiene que destruir antes los antiguos.</w:t>
+      </w:r>
+    </w:p>
+    <w:p>
+      <w:pPr>
+        <w:spacing w:after="160" w:line="360"/>
+        <w:jc w:val="both"/>
+      </w:pPr>
+      <w:r>
+        <w:t xml:space="preserve">Ese camino lo describe en Así habló Zaratustra con las tres transformaciones del espíritu. Primero el espíritu es un camello que carga con las normas, el "tú debes". Luego se convierte en león, que lucha contra ese "tú debes" y dice "yo quiero": conquista su libertad, pero solo sabe destruir. Por último se convierte en niño, que es inocencia, juego y un "santo decir sí": ya no destruye, sino que crea sus propios valores.</w:t>
+      </w:r>
+    </w:p>
+    <w:p>
+      <w:pPr>
+        <w:spacing w:after="160" w:line="360"/>
+        <w:jc w:val="both"/>
+      </w:pPr>
+      <w:r>
+        <w:t xml:space="preserve">Al final de ese camino está el superhombre, la idea central de Nietzsche. Zaratustra lo anuncia como "el sentido de la tierra" y pide que seamos fieles a la tierra y no creamos a quienes hablan de otro mundo. El hombre es solo "una cuerda tendida entre el animal y el superhombre", un puente y no una meta. El superhombre es el que, muerto Dios, no necesita a nadie que le diga lo que vale: crea sus propios valores, vive según su voluntad de poder y dice sí a la vida tal como es, con su dolor incluido. Es lo contrario del hombre del resentimiento.</w:t>
+      </w:r>
+    </w:p>
+    <w:p>
+      <w:pPr>
+        <w:spacing w:after="160" w:line="360"/>
+        <w:jc w:val="both"/>
+      </w:pPr>
+      <w:r>
+        <w:t xml:space="preserve">Para saber si alguien está cerca del superhombre, Nietzsche propone la prueba del eterno retorno: ¿qué dirías si un demonio te anunciara que vas a vivir tu vida exactamente igual una y otra vez? El débil maldeciría al demonio; el que va camino del superhombre lo celebraría, porque ama su vida entera. Por eso Nietzsche termina pidiendo una transmutación de todos los valores y escribe en El Anticristo una ley contra el cristianismo, al que considera el gran enemigo de la vida.</w:t>
+      </w:r>
+    </w:p>
+    <w:p>
+      <w:pPr>
+        <w:pStyle w:val="Heading1"/>
+      </w:pPr>
+      <w:r>
+        <w:t xml:space="preserve">4. Relación con otros autores</w:t>
+      </w:r>
+    </w:p>
+    <w:p>
+      <w:pPr>
+        <w:spacing w:after="160" w:line="360"/>
+        <w:jc w:val="both"/>
+      </w:pPr>
+      <w:r>
         <w:rPr>
           <w:b/>
           <w:bCs/>
         </w:rPr>
-        <w:t xml:space="preserve">El vitalismo. </w:t>
-      </w:r>
-      <w:r>
-        <w:t xml:space="preserve">Nietzsche defiende el vitalismo: lo bueno es lo que eleva la vida. Por eso ve el mundo contemporáneo como el horror, porque cree que la cultura europea, desde Platón y el cristianismo, ha ido en contra de la vida.</w:t>
+        <w:t xml:space="preserve">Nietzsche y Freud. </w:t>
+      </w:r>
+      <w:r>
+        <w:t xml:space="preserve">Los dos son maestros de la sospecha. Nietzsche ya dice que la mayor parte del pensar consciente está guiada por los instintos, y Freud lo convierte en una teoría con el inconsciente y el ello, una palabra que viene de Nietzsche. Para los dos la moral es algo que hay que desenmascarar: para Nietzsche es el resentimiento de los débiles y para Freud el superyó, las normas interiorizadas. Los dos ven la culpa como agresividad que no se puede descargar hacia fuera y se vuelve contra uno mismo. Y los dos critican la religión: Dios ha muerto para Nietzsche y es una ilusión para Freud. La diferencia es que Nietzsche quiere liberar los instintos y afirmar la vida, y Freud quiere que el yo controle las pulsiones.</w:t>
       </w:r>
     </w:p>
     <w:p>
@@ -189,10 +269,10 @@
           <w:b/>
           <w:bCs/>
         </w:rPr>
-        <w:t xml:space="preserve">El bien y el mal: señores y esclavos. </w:t>
-      </w:r>
-      <w:r>
-        <w:t xml:space="preserve">En La genealogía de la moral (1887) Nietzsche se pregunta de dónde vienen las palabras bueno y malo. Al principio los buenos eran los aristócratas, los que tienen poder. El hombre noble vive con confianza y franqueza frente a sí mismo, no se toma mucho tiempo en serio sus contratiempos porque tiene tanta fuerza que también olvida, y hasta respeta a sus enemigos y solo quiere uno que sea digno de él. Los nobles eran felices sin tener que convencerse de ello, y para ellos actuar y ser felices era lo mismo. Frente a ellos están los débiles, los oprimidos, los hombres del resentimiento. Para ellos la felicidad es algo pasivo: descanso, aturdimiento. El hombre del resentimiento no es franco ni honesto consigo mismo: su alma mira de reojo, ama los escondites y los caminos tortuosos, sabe callar, no olvidar y esperar. Por eso acaba siendo más inteligente que el noble.</w:t>
+        <w:t xml:space="preserve">Nietzsche y Marx. </w:t>
+      </w:r>
+      <w:r>
+        <w:t xml:space="preserve">También comparten la sospecha: detrás de la moral y la religión hay algo oculto, la voluntad de poder para Nietzsche y los intereses económicos de la clase dominante para Marx. Los dos critican la religión: para Marx es el opio del pueblo. Pero están en lados opuestos: Marx defiende a los oprimidos y quiere una sociedad sin clases, mientras que para Nietzsche el socialismo es una forma más del resentimiento de los débiles, igual que el cristianismo.</w:t>
       </w:r>
     </w:p>
     <w:p>
@@ -205,138 +285,10 @@
           <w:b/>
           <w:bCs/>
         </w:rPr>
-        <w:t xml:space="preserve">La rebelión de los esclavos en la moral. </w:t>
-      </w:r>
-      <w:r>
-        <w:t xml:space="preserve">Como los débiles no pueden vengarse con la acción, se vengan de forma imaginaria: el resentimiento se vuelve creador y crea valores. Llaman malo al fuerte y bueno al humilde, al pobre y al que sufre. Por eso su moral es siempre reacción, necesita a alguien a quien decir que no. La moral noble, en cambio, actúa y nace de sí misma: nosotros los nobles, nosotros los buenos, nosotros los bellos, nosotros los felices.</w:t>
-      </w:r>
-    </w:p>
-    <w:p>
-      <w:pPr>
-        <w:spacing w:after="160" w:line="360"/>
-        <w:jc w:val="both"/>
-      </w:pPr>
-      <w:r>
-        <w:rPr>
-          <w:b/>
-          <w:bCs/>
-        </w:rPr>
-        <w:t xml:space="preserve">Judea contra Roma: el cristianismo. </w:t>
-      </w:r>
-      <w:r>
-        <w:t xml:space="preserve">Para Nietzsche esta moral de esclavos viene del pueblo judío, que había extendido la religión, y lo peor del judaísmo es el cristianismo. Jesús, con su amor a los pobres, a los enfermos y a los pecadores, es para él el cebo más peligroso de esa venganza. Frente a Judea estaba Roma, los fuertes y los nobles. Pero ganó Judea, primero con el cristianismo. En el Renacimiento volvió el ideal clásico, pero el cristianismo fue llevado a peor con el protestantismo, y después con la Revolución francesa, en la que la última nobleza de Europa cayó bajo el resentimiento del pueblo. El último paso es el liberalismo, y también el socialismo y el anarquismo: el cristiano y el anarquista son, para él, los dos decadentes. (No hay que confundir esto con un antisemitismo político: Nietzsche despreciaba a los antisemitas de su época.)</w:t>
-      </w:r>
-    </w:p>
-    <w:p>
-      <w:pPr>
-        <w:spacing w:after="160" w:line="360"/>
-        <w:jc w:val="both"/>
-      </w:pPr>
-      <w:r>
-        <w:rPr>
-          <w:b/>
-          <w:bCs/>
-        </w:rPr>
-        <w:t xml:space="preserve">Un nuevo concepto de bien y mal. </w:t>
-      </w:r>
-      <w:r>
-        <w:t xml:space="preserve">En El Anticristo Nietzsche propone otra moral: bueno es todo lo que eleva en el hombre el sentimiento de poder, la voluntad de poder, el poder mismo. Malo es todo lo que viene de la debilidad. La felicidad es el sentimiento de que el poder crece, de haber superado una resistencia. No quiere paz, sino guerra; no virtud, sino habilidad. Y llega a decir que los débiles y los fracasados deben perecer, y que la compasión, que es lo que enseña el cristianismo, es peor que cualquier vicio.</w:t>
-      </w:r>
-    </w:p>
-    <w:p>
-      <w:pPr>
-        <w:spacing w:after="160" w:line="360"/>
-        <w:jc w:val="both"/>
-      </w:pPr>
-      <w:r>
-        <w:rPr>
-          <w:b/>
-          <w:bCs/>
-        </w:rPr>
-        <w:t xml:space="preserve">Dios ha muerto. </w:t>
-      </w:r>
-      <w:r>
-        <w:t xml:space="preserve">En La gaya ciencia aparece la parábola del loco. Un loco va con una linterna encendida en pleno día por la plaza gritando "¡busco a Dios!", y la gente que no cree en Dios se ríe de él. Entonces el loco les dice: "¡Dios ha muerto y lo hemos matado nosotros!". Y se pregunta: ¿cómo hemos podido vaciar el mar?, ¿sigue habiendo un arriba y un abajo?, ¿no vamos errando por una nada infinita? Que Dios ha muerto significa que Europa ya no cree en lo que daba sentido a todo, la verdad, la moral, el orden del mundo, pero todavía no se ha dado cuenta de lo que eso supone. El resultado es el nihilismo: nada vale nada. El hombre moderno se vuelve cada vez más débil, más mediocre, más cristiano, y estamos cansados del hombre.</w:t>
-      </w:r>
-    </w:p>
-    <w:p>
-      <w:pPr>
-        <w:spacing w:after="160" w:line="360"/>
-        <w:jc w:val="both"/>
-      </w:pPr>
-      <w:r>
-        <w:rPr>
-          <w:b/>
-          <w:bCs/>
-        </w:rPr>
-        <w:t xml:space="preserve">Voluntad de verdad y voluntad de poder. </w:t>
-      </w:r>
-      <w:r>
-        <w:t xml:space="preserve">Muchos pensadores han tenido una voluntad de verdad, pero para Nietzsche los que buscan la verdad son incapaces de ver el mundo como es. Se pregunta: ¿por qué queremos la verdad y no, más bien, la no verdad, la incertidumbre o la ignorancia? Todo el dogmatismo de los filósofos ha sido una noble puerilidad, porque la mayor parte de su pensar está guiada en secreto por sus instintos. Lo que hay detrás de todo es la voluntad de poder: en todos los seres vivos hay voluntad de poder, incluso en el que sirve hay voluntad de ser señor. No es solo voluntad de vivir, sino de ir siempre más allá, de crecer. Por eso no existen un bien y un mal eternos: quien quiere crear valores tiene que destruir antes los anteriores.</w:t>
-      </w:r>
-    </w:p>
-    <w:p>
-      <w:pPr>
-        <w:spacing w:after="160" w:line="360"/>
-        <w:jc w:val="both"/>
-      </w:pPr>
-      <w:r>
-        <w:rPr>
-          <w:b/>
-          <w:bCs/>
-        </w:rPr>
-        <w:t xml:space="preserve">Las tres transformaciones. </w:t>
-      </w:r>
-      <w:r>
-        <w:t xml:space="preserve">En Así habló Zaratustra Nietzsche explica el camino del espíritu con tres transformaciones. Primero el espíritu se convierte en camello, que carga con todo lo pesado, las normas y la moral, y se va con su carga al desierto. En el desierto el camello se convierte en león, que quiere conquistar su libertad y lucha contra el gran dragón, que se llama "tú debes"; frente a él, el león dice "yo quiero". Pero el león todavía tiene que convertirse en niño, porque el niño es inocencia, olvido, un nuevo comienzo, un juego, un santo decir sí. El niño ya no solo destruye los valores antiguos, sino que crea los suyos.</w:t>
-      </w:r>
-    </w:p>
-    <w:p>
-      <w:pPr>
-        <w:spacing w:after="160" w:line="360"/>
-        <w:jc w:val="both"/>
-      </w:pPr>
-      <w:r>
-        <w:rPr>
-          <w:b/>
-          <w:bCs/>
-        </w:rPr>
-        <w:t xml:space="preserve">El superhombre. </w:t>
-      </w:r>
-      <w:r>
-        <w:t xml:space="preserve">Es la idea más importante. En Así habló Zaratustra, Zaratustra dice: "¡Mirad, yo os enseño al superhombre! El superhombre es el sentido de la tierra". Les pide a todos que permanezcan fieles a la tierra y que no crean a los que hablan de esperanzas en otro mundo, porque son despreciadores de la vida. Como Dios ha muerto, ya no hay un más allá que dé sentido a la vida, y el sentido tiene que estar aquí. El hombre es una cuerda tendida entre el animal y el superhombre, una cuerda sobre el abismo. La grandeza del hombre está en ser un puente y no una meta. El superhombre es el que llega al final de las tres transformaciones: el que, después de la muerte de Dios, crea sus propios valores, afirma la vida tal como es y vive según su voluntad de poder. Es lo contrario del hombre del resentimiento y del cristiano, que para Nietzsche representa el mundo de la nada chocando con el superhombre.</w:t>
-      </w:r>
-    </w:p>
-    <w:p>
-      <w:pPr>
-        <w:spacing w:after="160" w:line="360"/>
-        <w:jc w:val="both"/>
-      </w:pPr>
-      <w:r>
-        <w:rPr>
-          <w:b/>
-          <w:bCs/>
-        </w:rPr>
-        <w:t xml:space="preserve">El eterno retorno. </w:t>
-      </w:r>
-      <w:r>
-        <w:t xml:space="preserve">En La gaya ciencia Nietzsche propone una posibilidad: ¿qué dirías si un día un demonio se metiera en tu soledad y te dijera que esta vida, tal como la estás viviendo, tendrás que vivirla otra vez y un número infinito de veces, sin nada nuevo, con cada dolor y cada placer en el mismo orden? ¿Te tirarías al suelo maldiciendo al demonio, o le contestarías "eres un dios, nunca he oído nada más divino"? La vida se repite en bucle, y lo importante es la reacción. Si reaccionas mal, eres un débil. Si te parece una buena idea, significa que estás en el camino de ser un superhombre, porque solo quien dice sí a toda su vida podría querer repetirla. Dependiendo de tu reacción se mide cómo vas.</w:t>
-      </w:r>
-    </w:p>
-    <w:p>
-      <w:pPr>
-        <w:spacing w:after="160" w:line="360"/>
-        <w:jc w:val="both"/>
-      </w:pPr>
-      <w:r>
-        <w:rPr>
-          <w:b/>
-          <w:bCs/>
-        </w:rPr>
-        <w:t xml:space="preserve">La ley contra el cristianismo. </w:t>
-      </w:r>
-      <w:r>
-        <w:t xml:space="preserve">Al final de El Anticristo Nietzsche escribe una ley contra el cristianismo en la que declara la guerra a muerte contra el vicio, y el vicio es el cristianismo. Dice que el sacerdote es el tipo de persona más vicioso porque enseña lo antinatural, que predicar la castidad es una incitación a lo antinatural y que palabras como Dios, salvador o santo deberían usarse como insultos. Termina pidiendo una transmutación de todos los valores.</w:t>
+        <w:t xml:space="preserve">Nietzsche y Sartre. </w:t>
+      </w:r>
+      <w:r>
+        <w:t xml:space="preserve">Sartre parte de la muerte de Dios de Nietzsche: si Dios no existe, nadie ha pensado una naturaleza humana, y el hombre está solo con su libertad. Para los dos no hay valores dados, sino que el hombre los crea, y el hombre es algo que se hace: un puente para Nietzsche y un proyecto para Sartre. El niño de las tres transformaciones se parece al hombre de Sartre, que al elegir se elige a sí mismo. La diferencia es que Sartre dice que al elegirme elijo para toda la humanidad, mientras que Nietzsche es aristocrático y desprecia la igualdad. Además Sartre vive la ausencia de Dios con angustia y náusea, y Nietzsche quiere responder con un sí a la vida.</w:t>
       </w:r>
     </w:p>
     <w:p>
@@ -344,55 +296,48 @@
         <w:pStyle w:val="Heading1"/>
       </w:pPr>
       <w:r>
-        <w:t xml:space="preserve">4. Relación con otros autores</w:t>
-      </w:r>
-    </w:p>
-    <w:p>
-      <w:pPr>
-        <w:spacing w:after="160" w:line="360"/>
-        <w:jc w:val="both"/>
-      </w:pPr>
-      <w:r>
-        <w:rPr>
-          <w:b/>
-          <w:bCs/>
-        </w:rPr>
-        <w:t xml:space="preserve">Nietzsche y Freud. </w:t>
-      </w:r>
-      <w:r>
-        <w:t xml:space="preserve">Los dos son maestros de la sospecha. Nietzsche ya dice que la mayor parte del pensar consciente está guiada por los instintos, y Freud lo convierte en una teoría con el inconsciente y el ello, una palabra que viene de Nietzsche. Para los dos la moral es algo que hay que desenmascarar: para Nietzsche es el resentimiento de los débiles y para Freud el superyó, las normas interiorizadas. Los dos ven la culpa como agresividad que no se puede descargar hacia fuera y se vuelve contra uno mismo. Y los dos critican la religión: Dios ha muerto para Nietzsche y es una ilusión para Freud. La diferencia es que Nietzsche quiere liberar los instintos y afirmar la vida, y Freud quiere que el yo controle las pulsiones.</w:t>
-      </w:r>
-    </w:p>
-    <w:p>
-      <w:pPr>
-        <w:spacing w:after="160" w:line="360"/>
-        <w:jc w:val="both"/>
-      </w:pPr>
-      <w:r>
-        <w:rPr>
-          <w:b/>
-          <w:bCs/>
-        </w:rPr>
-        <w:t xml:space="preserve">Nietzsche y Marx. </w:t>
-      </w:r>
-      <w:r>
-        <w:t xml:space="preserve">También comparten la sospecha: detrás de la moral y la religión hay algo oculto, la voluntad de poder para Nietzsche y los intereses económicos de la clase dominante para Marx. Los dos critican la religión: para Marx es el opio del pueblo. Pero están en lados opuestos: Marx defiende a los oprimidos y quiere una sociedad sin clases, mientras que para Nietzsche el socialismo es una forma más del resentimiento de los débiles, igual que el cristianismo.</w:t>
-      </w:r>
-    </w:p>
-    <w:p>
-      <w:pPr>
-        <w:spacing w:after="160" w:line="360"/>
-        <w:jc w:val="both"/>
-      </w:pPr>
-      <w:r>
-        <w:rPr>
-          <w:b/>
-          <w:bCs/>
-        </w:rPr>
-        <w:t xml:space="preserve">Nietzsche y Sartre. </w:t>
-      </w:r>
-      <w:r>
-        <w:t xml:space="preserve">Sartre parte de la muerte de Dios de Nietzsche: si Dios no existe, nadie ha pensado una naturaleza humana, y el hombre está solo con su libertad. Para los dos no hay valores dados, sino que el hombre los crea, y el hombre es algo que se hace: un puente para Nietzsche y un proyecto para Sartre. El niño de las tres transformaciones se parece al hombre de Sartre, que al elegir se elige a sí mismo. La diferencia es que Sartre dice que al elegirme elijo para toda la humanidad, mientras que Nietzsche es aristocrático y desprecia la igualdad. Además Sartre vive la ausencia de Dios con angustia y náusea, y Nietzsche quiere responder con un sí a la vida.</w:t>
+        <w:t xml:space="preserve">5. Comentario crítico</w:t>
+      </w:r>
+    </w:p>
+    <w:p>
+      <w:pPr>
+        <w:spacing w:after="160" w:line="360"/>
+        <w:jc w:val="both"/>
+      </w:pPr>
+      <w:r>
+        <w:t xml:space="preserve">Desde mi punto de vista, Nietzsche acierta al denunciar la hipocresía y la mediocridad, y en su ideal del hombre noble hay cosas admirables, como la franqueza o el respeto al enemigo. Pero su propuesta no se sostiene, y la primera razón la da él mismo. Si todo nuestro pensamiento está guiado por los instintos y la verdad es solo voluntad de poder, ¿por qué escribe libros para convencernos? Escribir para convencer supone que el lector puede razonar y cambiar de opinión libremente, justo lo que Nietzsche niega. Además, si toda verdad es solo una máscara del poder, su propia teoría también lo sería.</w:t>
+      </w:r>
+    </w:p>
+    <w:p>
+      <w:pPr>
+        <w:spacing w:after="160" w:line="360"/>
+        <w:jc w:val="both"/>
+      </w:pPr>
+      <w:r>
+        <w:t xml:space="preserve">En segundo lugar, explicar de dónde viene un valor no demuestra que sea falso. Aunque la compasión hubiera nacido del resentimiento, seguiría siendo bueno ayudar al que sufre. Nietzsche confunde el origen de una idea con su valor.</w:t>
+      </w:r>
+    </w:p>
+    <w:p>
+      <w:pPr>
+        <w:spacing w:after="160" w:line="360"/>
+        <w:jc w:val="both"/>
+      </w:pPr>
+      <w:r>
+        <w:t xml:space="preserve">En tercer lugar, Nietzsche dice "no virtud, sino habilidad". Pero para Aristóteles la virtud es un hábito: se adquiere repitiendo buenos actos y nos va haciendo mejores. Nadie nace valiente o generoso; se hace eligiendo una y otra vez. Esto muestra que el ser humano no está simplemente arrastrado por sus instintos: es racional y libre, y puede optar. Y lo que busca no es el poder, que siempre es un medio para otra cosa, sino la felicidad.</w:t>
+      </w:r>
+    </w:p>
+    <w:p>
+      <w:pPr>
+        <w:spacing w:after="160" w:line="360"/>
+        <w:jc w:val="both"/>
+      </w:pPr>
+      <w:r>
+        <w:t xml:space="preserve">Las consecuencias de su moral son graves: si lo bueno es la fuerza y "los débiles deben perecer", el valor de una persona depende de lo fuerte que sea, y el enfermo o el discapacitado valdrían menos. Por eso hay que unir la persona al ser. Ser humano es todo miembro de la especie homo sapiens sapiens; persona es un ser único e irrepetible, con dignidad. En Roma, la sociedad que Nietzsche admiraba, solo eran personas los hombres libres, romanos y paterfamilias, y fue el cristianismo el que extendió el concepto a todos. Santo Tomás, con Boecio, define la persona como una sustancia individual de naturaleza racional. Por eso su dignidad es ontológica: no depende de la fuerza ni del poder, sino que se tiene por el simple hecho de ser.</w:t>
+      </w:r>
+    </w:p>
+    <w:p>
+      <w:r>
+        <w:br w:type="page"/>
       </w:r>
     </w:p>
     <w:p>
@@ -400,73 +345,6 @@
         <w:pStyle w:val="Heading1"/>
       </w:pPr>
       <w:r>
-        <w:t xml:space="preserve">5. Comentario crítico</w:t>
-      </w:r>
-    </w:p>
-    <w:p>
-      <w:pPr>
-        <w:spacing w:after="160" w:line="360"/>
-        <w:jc w:val="both"/>
-      </w:pPr>
-      <w:r>
-        <w:t xml:space="preserve">Desde mi punto de vista, Nietzsche acierta al criticar la hipocresía y la mediocridad, y su retrato del hombre noble, franco y que respeta a su enemigo tiene algo admirable. Pero su propuesta no se puede asumir, y la primera razón está en su propio planteamiento. Nietzsche dice que todo nuestro pensamiento está guiado por los instintos, que la voluntad de verdad es solo voluntad de poder. Pero si todo lo que pensamos está determinado por nuestros instintos y sentimientos, ¿por qué escribe libros para convencernos? Escribir para convencer a alguien supone que el lector puede razonar, entender los argumentos y cambiar de opinión libremente. Es decir, Nietzsche niega con sus palabras la razón y la libertad que usa al escribir.</w:t>
-      </w:r>
-    </w:p>
-    <w:p>
-      <w:pPr>
-        <w:spacing w:after="160" w:line="360"/>
-        <w:jc w:val="both"/>
-      </w:pPr>
-      <w:r>
-        <w:t xml:space="preserve">La segunda razón es su idea de la virtud. Nietzsche dice: no virtud, sino habilidad. Pero para Aristóteles la virtud es un hábito: una disposición que se adquiere repitiendo buenos actos, que se convierte en una segunda naturaleza y que nos hace mejores. Nadie nace valiente o justo; uno se hace valiente actuando con valentía. Esto muestra que el ser humano no está simplemente movido por sus instintos, sino que puede formarse a sí mismo, educar sus impulsos y elegir. Lo importante es saber que el ser humano puede optar.</w:t>
-      </w:r>
-    </w:p>
-    <w:p>
-      <w:pPr>
-        <w:spacing w:after="160" w:line="360"/>
-        <w:jc w:val="both"/>
-      </w:pPr>
-      <w:r>
-        <w:t xml:space="preserve">Por eso hay que volver a la pregunta: ¿qué es el ser humano? Un ser racional y libre. Si observamos la escala de los seres sin prejuicios, los seres inertes son; los seres vivos son y viven; y los seres humanos son, viven y entienden. La vida es la manera de ser de los seres vivos, no una fuerza ciega añadida a ellos. ¿Solo los seres humanos tenemos finalidades? Todo ser vivo tiende a su propio bien, pero el ser humano además conoce su fin y lo elige. Y el fin de la vida humana no es el poder, ni siquiera la libertad, sino la felicidad. El poder es solo un medio: siempre se quiere poder para algo.</w:t>
-      </w:r>
-    </w:p>
-    <w:p>
-      <w:pPr>
-        <w:spacing w:after="160" w:line="360"/>
-        <w:jc w:val="both"/>
-      </w:pPr>
-      <w:r>
-        <w:t xml:space="preserve">Esto tiene consecuencias graves para la concepción del ser humano. Si lo bueno es lo que aumenta el poder y los débiles deben perecer, el valor de una persona depende de su fuerza. El enfermo, el anciano o el discapacitado valdrían menos. Es lo mismo que defendían el darwinismo social, la eugenesia de Galton y el racismo, y lo que después se hizo con la obra de Nietzsche en el nazismo. Hoy se ve en autores como Peter Singer, que distingue entre seres humanos que son personas y otros que no lo son.</w:t>
-      </w:r>
-    </w:p>
-    <w:p>
-      <w:pPr>
-        <w:spacing w:after="160" w:line="360"/>
-        <w:jc w:val="both"/>
-      </w:pPr>
-      <w:r>
-        <w:t xml:space="preserve">Ser humano es todo miembro de la especie homo sapiens sapiens. Persona es un ser único e irrepetible, con dignidad. La palabra viene del teatro, donde la persona era la máscara o el personaje, y antiguamente no todos se consideraban personas: en Roma solo el hombre libre, romano y paterfamilias, una sociedad aristocrática como la que Nietzsche admiraba. Fue precisamente el cristianismo, que él tanto desprecia, el que amplió el concepto a todos. Santo Tomás de Aquino coge la definición de Boecio: persona es una sustancia individual de naturaleza racional.</w:t>
-      </w:r>
-    </w:p>
-    <w:p>
-      <w:pPr>
-        <w:spacing w:after="160" w:line="360"/>
-        <w:jc w:val="both"/>
-      </w:pPr>
-      <w:r>
-        <w:t xml:space="preserve">Por tanto la persona va necesariamente unida al ser, y de ahí existe la dignidad humana: sin ser no existe. Es una dignidad ontológica, que no depende de la fuerza, de la salud ni del poder, sino que se tiene por el simple hecho de ser. Los seres humanos somos racionales y libres, y nuestra vida tiene como fin la felicidad.</w:t>
-      </w:r>
-    </w:p>
-    <w:p>
-      <w:r>
-        <w:br w:type="page"/>
-      </w:r>
-    </w:p>
-    <w:p>
-      <w:pPr>
-        <w:pStyle w:val="Heading1"/>
-      </w:pPr>
-      <w:r>
         <w:t xml:space="preserve">Esquema para el parcial</w:t>
       </w:r>
     </w:p>
@@ -675,7 +553,7 @@
         <w:spacing w:after="100" w:line="320"/>
       </w:pPr>
       <w:r>
-        <w:t xml:space="preserve">Crítica: si todo es instinto, ¿por qué escribe libros para convencernos?; virtud = hábito (Aristóteles); el hombre puede optar; escala de los seres; el fin es la felicidad; los débiles deben perecer → Singer; persona (Boecio) → dignidad ontológica.</w:t>
+        <w:t xml:space="preserve">Crítica: escribe libros para convencernos (y su teoría sería también poder); el origen de un valor no prueba que sea falso; virtud = hábito (Aristóteles), el hombre puede optar, busca la felicidad; los débiles deben perecer → persona (Boecio) → dignidad ontológica.</w:t>
       </w:r>
     </w:p>
     <w:sectPr>

</xml_diff>